<commit_message>
Updated enterprise analytics project with advanced analytics and dashboard improvements
</commit_message>
<xml_diff>
--- a/documentation/Enterprise_Sales_Analytics_Documentation.docx
+++ b/documentation/Enterprise_Sales_Analytics_Documentation.docx
@@ -170,6 +170,7 @@
               </w:pBdr>
               <w:spacing w:after="240"/>
             </w:pPr>
+            <w:proofErr w:type="spellStart"/>
             <w:r>
               <w:rPr>
                 <w:b/>
@@ -178,7 +179,18 @@
                 <w:sz w:val="36"/>
                 <w:szCs w:val="36"/>
               </w:rPr>
-              <w:t>Rohit.P.B.</w:t>
+              <w:t>Rohit.P.B</w:t>
+            </w:r>
+            <w:proofErr w:type="spellEnd"/>
+            <w:r>
+              <w:rPr>
+                <w:b/>
+                <w:bCs/>
+                <w:color w:val="1F3864"/>
+                <w:sz w:val="36"/>
+                <w:szCs w:val="36"/>
+              </w:rPr>
+              <w:t>.</w:t>
             </w:r>
           </w:p>
           <w:p>
@@ -315,22 +327,50 @@
                 <w:tab w:val="right" w:pos="10560"/>
               </w:tabs>
             </w:pPr>
+            <w:proofErr w:type="gramStart"/>
             <w:r>
               <w:rPr>
                 <w:color w:val="9DC3E6"/>
                 <w:sz w:val="15"/>
                 <w:szCs w:val="15"/>
               </w:rPr>
-              <w:t>CONFIDENTIAL  •  FOR INTERNAL &amp; PORTFOLIO USE</w:t>
-            </w:r>
+              <w:t>CONFIDENTIAL  •</w:t>
+            </w:r>
+            <w:proofErr w:type="gramEnd"/>
             <w:r>
               <w:rPr>
                 <w:color w:val="9DC3E6"/>
                 <w:sz w:val="15"/>
                 <w:szCs w:val="15"/>
               </w:rPr>
+              <w:t xml:space="preserve">  FOR INTERNAL &amp; PORTFOLIO USE</w:t>
+            </w:r>
+            <w:r>
+              <w:rPr>
+                <w:color w:val="9DC3E6"/>
+                <w:sz w:val="15"/>
+                <w:szCs w:val="15"/>
+              </w:rPr>
               <w:tab/>
-              <w:t>© 2024 Rohit.P.B.</w:t>
+              <w:t xml:space="preserve">© 2024 </w:t>
+            </w:r>
+            <w:proofErr w:type="spellStart"/>
+            <w:r>
+              <w:rPr>
+                <w:color w:val="9DC3E6"/>
+                <w:sz w:val="15"/>
+                <w:szCs w:val="15"/>
+              </w:rPr>
+              <w:t>Rohit.P.B</w:t>
+            </w:r>
+            <w:proofErr w:type="spellEnd"/>
+            <w:r>
+              <w:rPr>
+                <w:color w:val="9DC3E6"/>
+                <w:sz w:val="15"/>
+                <w:szCs w:val="15"/>
+              </w:rPr>
+              <w:t>.</w:t>
             </w:r>
           </w:p>
         </w:tc>
@@ -828,7 +868,15 @@
         <w:spacing w:after="160"/>
       </w:pPr>
       <w:r>
-        <w:t>This project presents an end-to-end enterprise sales analytics workflow built using Excel, Power Query, a Dockerized MySQL environment, SQL-based analytics, and Tableau dashboards.</w:t>
+        <w:t xml:space="preserve">This project presents an end-to-end enterprise sales analytics workflow built using Excel, Power Query, a </w:t>
+      </w:r>
+      <w:proofErr w:type="spellStart"/>
+      <w:r>
+        <w:t>Dockerized</w:t>
+      </w:r>
+      <w:proofErr w:type="spellEnd"/>
+      <w:r>
+        <w:t xml:space="preserve"> MySQL environment, SQL-based analytics, and Tableau dashboards.</w:t>
       </w:r>
     </w:p>
     <w:p>
@@ -980,8 +1028,13 @@
         <w:spacing w:after="100"/>
       </w:pPr>
       <w:r>
-        <w:t>Containerized MySQL database deployment using Docker</w:t>
-      </w:r>
+        <w:t xml:space="preserve">Containerized MySQL database deployment using </w:t>
+      </w:r>
+      <w:proofErr w:type="spellStart"/>
+      <w:r>
+        <w:t>Docker</w:t>
+      </w:r>
+      <w:proofErr w:type="spellEnd"/>
     </w:p>
     <w:p>
       <w:pPr>
@@ -1081,6 +1134,19 @@
       </w:pPr>
       <w:r>
         <w:t>Demonstrate end-to-end analytics integration</w:t>
+      </w:r>
+    </w:p>
+    <w:p>
+      <w:pPr>
+        <w:pStyle w:val="ListParagraph"/>
+        <w:numPr>
+          <w:ilvl w:val="0"/>
+          <w:numId w:val="7"/>
+        </w:numPr>
+        <w:spacing w:after="100"/>
+      </w:pPr>
+      <w:r>
+        <w:t>Perform advanced operational analytics including forecasting and trend analysis</w:t>
       </w:r>
     </w:p>
     <w:p>
@@ -1395,12 +1461,21 @@
             </w:tcMar>
           </w:tcPr>
           <w:p>
+            <w:proofErr w:type="spellStart"/>
             <w:r>
               <w:rPr>
                 <w:sz w:val="20"/>
                 <w:szCs w:val="20"/>
               </w:rPr>
-              <w:t>Docker Desktop, MySQL</w:t>
+              <w:t>Docker</w:t>
+            </w:r>
+            <w:proofErr w:type="spellEnd"/>
+            <w:r>
+              <w:rPr>
+                <w:sz w:val="20"/>
+                <w:szCs w:val="20"/>
+              </w:rPr>
+              <w:t xml:space="preserve"> Desktop, MySQL</w:t>
             </w:r>
           </w:p>
         </w:tc>
@@ -1456,8 +1531,17 @@
                 <w:sz w:val="20"/>
                 <w:szCs w:val="20"/>
               </w:rPr>
-              <w:t>SQL, TablePlus</w:t>
-            </w:r>
+              <w:t xml:space="preserve">SQL, </w:t>
+            </w:r>
+            <w:proofErr w:type="spellStart"/>
+            <w:r>
+              <w:rPr>
+                <w:sz w:val="20"/>
+                <w:szCs w:val="20"/>
+              </w:rPr>
+              <w:t>TablePlus</w:t>
+            </w:r>
+            <w:proofErr w:type="spellEnd"/>
           </w:p>
         </w:tc>
       </w:tr>
@@ -1563,6 +1647,7 @@
             </w:tcMar>
           </w:tcPr>
           <w:p>
+            <w:proofErr w:type="spellStart"/>
             <w:r>
               <w:rPr>
                 <w:sz w:val="20"/>
@@ -1570,6 +1655,7 @@
               </w:rPr>
               <w:t>GitHub</w:t>
             </w:r>
+            <w:proofErr w:type="spellEnd"/>
           </w:p>
         </w:tc>
       </w:tr>
@@ -1636,15 +1722,23 @@
     </w:p>
     <w:p>
       <w:pPr>
+        <w:pStyle w:val="ListParagraph"/>
+        <w:numPr>
+          <w:ilvl w:val="0"/>
+          <w:numId w:val="10"/>
+        </w:numPr>
+        <w:spacing w:after="100"/>
+      </w:pPr>
+      <w:r>
+        <w:lastRenderedPageBreak/>
+        <w:t>Pareto product contribution analysis identified key products driving the majority of overall revenue.</w:t>
+      </w:r>
+    </w:p>
+    <w:p>
+      <w:pPr>
         <w:pStyle w:val="Heading1"/>
       </w:pPr>
-    </w:p>
-    <w:p>
-      <w:pPr>
-        <w:pStyle w:val="Heading1"/>
-      </w:pPr>
-      <w:r>
-        <w:lastRenderedPageBreak/>
+      <w:r>
         <w:t>8. Key Performance Indicators (KPIs)</w:t>
       </w:r>
     </w:p>
@@ -2202,12 +2296,7 @@
     </w:p>
     <w:p>
       <w:pPr>
-        <w:spacing w:before="160"/>
-      </w:pPr>
-    </w:p>
-    <w:p>
-      <w:pPr>
-        <w:jc w:val="center"/>
+        <w:pStyle w:val="NormalWeb"/>
       </w:pPr>
       <w:r>
         <w:rPr>
@@ -2215,10 +2304,10 @@
         </w:rPr>
         <w:lastRenderedPageBreak/>
         <w:drawing>
-          <wp:inline distT="0" distB="0" distL="0" distR="0">
-            <wp:extent cx="2476500" cy="8296275"/>
-            <wp:effectExtent l="0" t="0" r="0" b="0"/>
-            <wp:docPr id="1" name="Picture 1"/>
+          <wp:inline distT="0" distB="0" distL="0" distR="0" wp14:anchorId="412ECB6F" wp14:editId="3B3F3FF6">
+            <wp:extent cx="2476500" cy="8201025"/>
+            <wp:effectExtent l="0" t="0" r="0" b="9525"/>
+            <wp:docPr id="5" name="Picture 5" descr="C:\Users\user\Downloads\Enterprise_Anlaytics_Architecture.drawio.png"/>
             <wp:cNvGraphicFramePr>
               <a:graphicFrameLocks xmlns:a="http://schemas.openxmlformats.org/drawingml/2006/main" noChangeAspect="1"/>
             </wp:cNvGraphicFramePr>
@@ -2226,13 +2315,19 @@
               <a:graphicData uri="http://schemas.openxmlformats.org/drawingml/2006/picture">
                 <pic:pic xmlns:pic="http://schemas.openxmlformats.org/drawingml/2006/picture">
                   <pic:nvPicPr>
-                    <pic:cNvPr id="0" name=""/>
+                    <pic:cNvPr id="0" name="Picture 5" descr="C:\Users\user\Downloads\Enterprise_Anlaytics_Architecture.drawio.png"/>
                     <pic:cNvPicPr>
                       <a:picLocks noChangeAspect="1" noChangeArrowheads="1"/>
                     </pic:cNvPicPr>
                   </pic:nvPicPr>
                   <pic:blipFill>
-                    <a:blip r:embed="rId10"/>
+                    <a:blip r:embed="rId10">
+                      <a:extLst>
+                        <a:ext uri="{28A0092B-C50C-407E-A947-70E740481C1C}">
+                          <a14:useLocalDpi xmlns:a14="http://schemas.microsoft.com/office/drawing/2010/main" val="0"/>
+                        </a:ext>
+                      </a:extLst>
+                    </a:blip>
                     <a:srcRect/>
                     <a:stretch>
                       <a:fillRect/>
@@ -2241,11 +2336,15 @@
                   <pic:spPr bwMode="auto">
                     <a:xfrm>
                       <a:off x="0" y="0"/>
-                      <a:ext cx="2476500" cy="8296275"/>
+                      <a:ext cx="2476500" cy="8201025"/>
                     </a:xfrm>
                     <a:prstGeom prst="rect">
                       <a:avLst/>
                     </a:prstGeom>
+                    <a:noFill/>
+                    <a:ln>
+                      <a:noFill/>
+                    </a:ln>
                   </pic:spPr>
                 </pic:pic>
               </a:graphicData>
@@ -2256,14 +2355,12 @@
     </w:p>
     <w:p>
       <w:pPr>
-        <w:spacing w:before="160"/>
+        <w:pStyle w:val="NormalWeb"/>
       </w:pPr>
       <w:r>
         <w:lastRenderedPageBreak/>
         <w:t>Figure 1: Enterprise Analytics Workflow Architecture</w:t>
       </w:r>
-      <w:bookmarkStart w:id="0" w:name="_GoBack"/>
-      <w:bookmarkEnd w:id="0"/>
     </w:p>
     <w:p>
       <w:pPr>
@@ -2278,7 +2375,15 @@
         <w:spacing w:after="160"/>
       </w:pPr>
       <w:r>
-        <w:t>Raw operational sales data was transformed and cleaned using Power Query in Excel. The cleaned dataset was then exported as CSV and integrated into a Dockerized MySQL database environment.</w:t>
+        <w:t xml:space="preserve">Raw operational sales data was transformed and cleaned using Power Query in Excel. The cleaned dataset was then exported as CSV and integrated into a </w:t>
+      </w:r>
+      <w:proofErr w:type="spellStart"/>
+      <w:r>
+        <w:t>Dockerized</w:t>
+      </w:r>
+      <w:proofErr w:type="spellEnd"/>
+      <w:r>
+        <w:t xml:space="preserve"> MySQL database environment.</w:t>
       </w:r>
     </w:p>
     <w:p>
@@ -2286,7 +2391,21 @@
         <w:spacing w:after="160"/>
       </w:pPr>
       <w:r>
-        <w:t>SQL queries were executed against the database to perform KPI reporting, profitability analysis, and operational sales analytics. The resulting analytical outputs were visualized using Tableau dashboards to support business intelligence reporting.</w:t>
+        <w:t>SQL queries were executed against the database to perform KPI reporting, profitability analysis, and operational sales analytics.</w:t>
+      </w:r>
+      <w:r>
+        <w:t xml:space="preserve"> </w:t>
+      </w:r>
+      <w:r>
+        <w:t>Advanced analytics techniques including forecasting, trend analysis, Pareto analysis, and root cause analysis were incorporated to enhance operational business insights and KPI visibility.</w:t>
+      </w:r>
+    </w:p>
+    <w:p>
+      <w:pPr>
+        <w:spacing w:after="160"/>
+      </w:pPr>
+      <w:r>
+        <w:t xml:space="preserve"> The resulting analytical outputs were visualized using Tableau dashboards to support business intelligence reporting.</w:t>
       </w:r>
     </w:p>
     <w:p>
@@ -2372,6 +2491,40 @@
     </w:p>
     <w:p>
       <w:pPr>
+        <w:pStyle w:val="ListParagraph"/>
+        <w:numPr>
+          <w:ilvl w:val="0"/>
+          <w:numId w:val="11"/>
+        </w:numPr>
+        <w:spacing w:after="100"/>
+      </w:pPr>
+      <w:r>
+        <w:t>Forecast Analysis</w:t>
+      </w:r>
+    </w:p>
+    <w:p>
+      <w:pPr>
+        <w:pStyle w:val="ListParagraph"/>
+        <w:numPr>
+          <w:ilvl w:val="0"/>
+          <w:numId w:val="11"/>
+        </w:numPr>
+        <w:spacing w:after="100"/>
+      </w:pPr>
+      <w:r>
+        <w:t xml:space="preserve">Pareto Product </w:t>
+      </w:r>
+      <w:bookmarkStart w:id="0" w:name="_GoBack"/>
+      <w:bookmarkEnd w:id="0"/>
+      <w:r>
+        <w:t xml:space="preserve"> Revenue</w:t>
+      </w:r>
+      <w:r>
+        <w:t xml:space="preserve"> Analysis</w:t>
+      </w:r>
+    </w:p>
+    <w:p>
+      <w:pPr>
         <w:pStyle w:val="Heading1"/>
       </w:pPr>
       <w:r>
@@ -2436,6 +2589,32 @@
       </w:pPr>
       <w:r>
         <w:t>Top Product Revenue Contribution</w:t>
+      </w:r>
+    </w:p>
+    <w:p>
+      <w:pPr>
+        <w:pStyle w:val="ListParagraph"/>
+        <w:numPr>
+          <w:ilvl w:val="0"/>
+          <w:numId w:val="12"/>
+        </w:numPr>
+        <w:spacing w:after="100"/>
+      </w:pPr>
+      <w:r>
+        <w:t>Forecast Trend Visualization</w:t>
+      </w:r>
+    </w:p>
+    <w:p>
+      <w:pPr>
+        <w:pStyle w:val="ListParagraph"/>
+        <w:numPr>
+          <w:ilvl w:val="0"/>
+          <w:numId w:val="12"/>
+        </w:numPr>
+        <w:spacing w:after="100"/>
+      </w:pPr>
+      <w:r>
+        <w:t>Product Contribution Analysis</w:t>
       </w:r>
     </w:p>
     <w:p>
@@ -2958,7 +3137,15 @@
         <w:spacing w:after="160"/>
       </w:pPr>
       <w:r>
-        <w:t>This project successfully demonstrates an end-to-end enterprise sales analytics workflow integrating Excel, Power Query, Dockerized MySQL, SQL analytics, and Tableau dashboards.</w:t>
+        <w:t xml:space="preserve">This project successfully demonstrates an end-to-end enterprise sales analytics workflow integrating Excel, Power Query, </w:t>
+      </w:r>
+      <w:proofErr w:type="spellStart"/>
+      <w:r>
+        <w:t>Dockerized</w:t>
+      </w:r>
+      <w:proofErr w:type="spellEnd"/>
+      <w:r>
+        <w:t xml:space="preserve"> MySQL, SQL analytics, and Tableau dashboards.</w:t>
       </w:r>
     </w:p>
     <w:p>
@@ -3058,7 +3245,10 @@
         <w:spacing w:after="100"/>
       </w:pPr>
       <w:r>
-        <w:t>Advanced predictive analytics implementation</w:t>
+        <w:t>Advanced pre</w:t>
+      </w:r>
+      <w:r>
+        <w:t>dictive and forecasting analytics</w:t>
       </w:r>
     </w:p>
     <w:sectPr>
@@ -3103,13 +3293,23 @@
         <w:tab w:val="right" w:pos="9026"/>
       </w:tabs>
     </w:pPr>
+    <w:proofErr w:type="gramStart"/>
     <w:r>
       <w:rPr>
         <w:color w:val="595959"/>
         <w:sz w:val="16"/>
         <w:szCs w:val="16"/>
       </w:rPr>
-      <w:t>Confidential  •  For Internal &amp; Portfolio Use</w:t>
+      <w:t>Confidential  •</w:t>
+    </w:r>
+    <w:proofErr w:type="gramEnd"/>
+    <w:r>
+      <w:rPr>
+        <w:color w:val="595959"/>
+        <w:sz w:val="16"/>
+        <w:szCs w:val="16"/>
+      </w:rPr>
+      <w:t xml:space="preserve">  For Internal &amp; Portfolio Use</w:t>
     </w:r>
     <w:r>
       <w:rPr>
@@ -3184,13 +3384,23 @@
         <w:tab w:val="right" w:pos="9026"/>
       </w:tabs>
     </w:pPr>
+    <w:proofErr w:type="gramStart"/>
     <w:r>
       <w:rPr>
         <w:color w:val="595959"/>
         <w:sz w:val="16"/>
         <w:szCs w:val="16"/>
       </w:rPr>
-      <w:t>Confidential  •  For Internal &amp; Portfolio Use</w:t>
+      <w:t>Confidential  •</w:t>
+    </w:r>
+    <w:proofErr w:type="gramEnd"/>
+    <w:r>
+      <w:rPr>
+        <w:color w:val="595959"/>
+        <w:sz w:val="16"/>
+        <w:szCs w:val="16"/>
+      </w:rPr>
+      <w:t xml:space="preserve">  For Internal &amp; Portfolio Use</w:t>
     </w:r>
     <w:r>
       <w:rPr>
@@ -3238,7 +3448,7 @@
         <w:sz w:val="16"/>
         <w:szCs w:val="16"/>
       </w:rPr>
-      <w:t>4</w:t>
+      <w:t>7</w:t>
     </w:r>
     <w:r>
       <w:rPr>
@@ -5055,6 +5265,22 @@
       <w:szCs w:val="16"/>
     </w:rPr>
   </w:style>
+  <w:style w:type="paragraph" w:styleId="NormalWeb">
+    <w:name w:val="Normal (Web)"/>
+    <w:basedOn w:val="Normal"/>
+    <w:uiPriority w:val="99"/>
+    <w:unhideWhenUsed/>
+    <w:rsid w:val="00EB29CA"/>
+    <w:pPr>
+      <w:spacing w:before="100" w:beforeAutospacing="1" w:after="100" w:afterAutospacing="1"/>
+    </w:pPr>
+    <w:rPr>
+      <w:rFonts w:ascii="Times New Roman" w:eastAsia="Times New Roman" w:hAnsi="Times New Roman" w:cs="Times New Roman"/>
+      <w:color w:val="auto"/>
+      <w:sz w:val="24"/>
+      <w:szCs w:val="24"/>
+    </w:rPr>
+  </w:style>
 </w:styles>
 </file>
 
@@ -5437,6 +5663,22 @@
       <w:szCs w:val="16"/>
     </w:rPr>
   </w:style>
+  <w:style w:type="paragraph" w:styleId="NormalWeb">
+    <w:name w:val="Normal (Web)"/>
+    <w:basedOn w:val="Normal"/>
+    <w:uiPriority w:val="99"/>
+    <w:unhideWhenUsed/>
+    <w:rsid w:val="00EB29CA"/>
+    <w:pPr>
+      <w:spacing w:before="100" w:beforeAutospacing="1" w:after="100" w:afterAutospacing="1"/>
+    </w:pPr>
+    <w:rPr>
+      <w:rFonts w:ascii="Times New Roman" w:eastAsia="Times New Roman" w:hAnsi="Times New Roman" w:cs="Times New Roman"/>
+      <w:color w:val="auto"/>
+      <w:sz w:val="24"/>
+      <w:szCs w:val="24"/>
+    </w:rPr>
+  </w:style>
 </w:styles>
 </file>
 

</xml_diff>